<commit_message>
DP : supprime les pages vides + corrige la capture mobile
- Retire les sauts de page et paragraphes vides qui généraient des pages blanches
- Redimensionne la capture mobile (portrait 10in -> 6.3in) pour que l'image et sa légende tiennent sur une seule page
- Résultat : 28 pages, aucune page blanche
</commit_message>
<xml_diff>
--- a/dossier-professionnel/DP_rempli.docx
+++ b/dossier-professionnel/DP_rempli.docx
@@ -516,17 +516,6 @@
         </w:tc>
       </w:tr>
     </w:tbl>
-    <w:p>
-      <w:pPr>
-        <w:rPr>
-          <w:rFonts w:cstheme="minorHAnsi"/>
-          <w:b/>
-          <w:color w:val="404040" w:themeColor="text1" w:themeTint="BF"/>
-          <w:sz w:val="28"/>
-          <w:szCs w:val="28"/>
-        </w:rPr>
-      </w:pPr>
-    </w:p>
     <w:p>
       <w:pPr>
         <w:rPr>
@@ -934,17 +923,6 @@
         </w:tc>
       </w:tr>
     </w:tbl>
-    <w:p>
-      <w:pPr>
-        <w:rPr>
-          <w:rFonts w:cstheme="minorHAnsi"/>
-          <w:b/>
-          <w:color w:val="404040" w:themeColor="text1" w:themeTint="BF"/>
-          <w:sz w:val="28"/>
-          <w:szCs w:val="28"/>
-        </w:rPr>
-      </w:pPr>
-    </w:p>
     <w:p>
       <w:pPr>
         <w:rPr>
@@ -3145,34 +3123,6 @@
         <w:rPr>
           <w:rFonts w:cstheme="minorHAnsi"/>
           <w:color w:val="404040" w:themeColor="text1" w:themeTint="BF"/>
-        </w:rPr>
-      </w:pPr>
-    </w:p>
-    <w:p>
-      <w:pPr>
-        <w:spacing w:after="0"/>
-        <w:jc w:val="center"/>
-        <w:rPr>
-          <w:rFonts w:cstheme="minorHAnsi"/>
-          <w:b/>
-          <w:smallCaps/>
-          <w:color w:val="404040" w:themeColor="text1" w:themeTint="BF"/>
-          <w:sz w:val="96"/>
-          <w:szCs w:val="96"/>
-        </w:rPr>
-      </w:pPr>
-    </w:p>
-    <w:p>
-      <w:pPr>
-        <w:spacing w:after="0"/>
-        <w:jc w:val="center"/>
-        <w:rPr>
-          <w:rFonts w:cstheme="minorHAnsi"/>
-          <w:b/>
-          <w:smallCaps/>
-          <w:color w:val="404040" w:themeColor="text1" w:themeTint="BF"/>
-          <w:sz w:val="96"/>
-          <w:szCs w:val="96"/>
         </w:rPr>
       </w:pPr>
     </w:p>
@@ -4840,11 +4790,6 @@
         </w:tc>
       </w:tr>
     </w:tbl>
-    <w:p>
-      <w:r>
-        <w:br w:type="page"/>
-      </w:r>
-    </w:p>
     <w:tbl>
       <w:tblPr>
         <w:tblStyle w:val="Grilledutableau"/>
@@ -11523,22 +11468,6 @@
       </w:tr>
     </w:tbl>
     <w:p/>
-    <w:p/>
-    <w:p/>
-    <w:p/>
-    <w:p>
-      <w:pPr>
-        <w:spacing w:after="0"/>
-        <w:rPr>
-          <w:rFonts w:cstheme="minorHAnsi"/>
-          <w:b/>
-          <w:smallCaps/>
-          <w:color w:val="404040" w:themeColor="text1" w:themeTint="BF"/>
-          <w:sz w:val="40"/>
-          <w:szCs w:val="28"/>
-        </w:rPr>
-      </w:pPr>
-    </w:p>
     <w:tbl>
       <w:tblPr>
         <w:tblStyle w:val="Grilledutableau"/>
@@ -12711,191 +12640,6 @@
     </w:p>
     <w:p>
       <w:pPr>
-        <w:spacing w:after="0"/>
-        <w:rPr>
-          <w:rFonts w:cstheme="minorHAnsi"/>
-          <w:color w:val="404040" w:themeColor="text1" w:themeTint="BF"/>
-          <w:sz w:val="24"/>
-          <w:szCs w:val="24"/>
-        </w:rPr>
-      </w:pPr>
-    </w:p>
-    <w:p>
-      <w:pPr>
-        <w:spacing w:after="0"/>
-        <w:rPr>
-          <w:rFonts w:cstheme="minorHAnsi"/>
-          <w:color w:val="404040" w:themeColor="text1" w:themeTint="BF"/>
-          <w:sz w:val="24"/>
-          <w:szCs w:val="24"/>
-        </w:rPr>
-      </w:pPr>
-    </w:p>
-    <w:p>
-      <w:pPr>
-        <w:spacing w:after="0"/>
-        <w:rPr>
-          <w:rFonts w:cstheme="minorHAnsi"/>
-          <w:color w:val="404040" w:themeColor="text1" w:themeTint="BF"/>
-          <w:sz w:val="24"/>
-          <w:szCs w:val="24"/>
-        </w:rPr>
-      </w:pPr>
-      <w:r>
-        <w:rPr>
-          <w:rFonts w:cstheme="minorHAnsi"/>
-          <w:noProof/>
-          <w:color w:val="404040" w:themeColor="text1" w:themeTint="BF"/>
-          <w:sz w:val="24"/>
-          <w:szCs w:val="24"/>
-          <w:lang w:eastAsia="fr-FR"/>
-        </w:rPr>
-        <mc:AlternateContent>
-          <mc:Choice Requires="wps">
-            <w:drawing>
-              <wp:anchor distT="0" distB="0" distL="114300" distR="114300" simplePos="0" relativeHeight="251660288" behindDoc="0" locked="0" layoutInCell="1" allowOverlap="1" wp14:anchorId="4082132F" wp14:editId="5926D8A6">
-                <wp:simplePos x="0" y="0"/>
-                <wp:positionH relativeFrom="column">
-                  <wp:posOffset>2011045</wp:posOffset>
-                </wp:positionH>
-                <wp:positionV relativeFrom="paragraph">
-                  <wp:posOffset>123190</wp:posOffset>
-                </wp:positionV>
-                <wp:extent cx="3618964" cy="388620"/>
-                <wp:effectExtent l="0" t="0" r="0" b="0"/>
-                <wp:wrapNone/>
-                <wp:docPr id="307" name="Zone de texte 2"/>
-                <wp:cNvGraphicFramePr>
-                  <a:graphicFrameLocks xmlns:a="http://schemas.openxmlformats.org/drawingml/2006/main"/>
-                </wp:cNvGraphicFramePr>
-                <a:graphic xmlns:a="http://schemas.openxmlformats.org/drawingml/2006/main">
-                  <a:graphicData uri="http://schemas.microsoft.com/office/word/2010/wordprocessingShape">
-                    <wps:wsp>
-                      <wps:cNvSpPr txBox="1">
-                        <a:spLocks noChangeArrowheads="1"/>
-                      </wps:cNvSpPr>
-                      <wps:spPr bwMode="auto">
-                        <a:xfrm>
-                          <a:off x="0" y="0"/>
-                          <a:ext cx="3618964" cy="388620"/>
-                        </a:xfrm>
-                        <a:prstGeom prst="rect">
-                          <a:avLst/>
-                        </a:prstGeom>
-                        <a:noFill/>
-                        <a:ln w="9525">
-                          <a:noFill/>
-                          <a:miter lim="800000"/>
-                          <a:headEnd/>
-                          <a:tailEnd/>
-                        </a:ln>
-                      </wps:spPr>
-                      <wps:txbx>
-                        <w:txbxContent>
-                          <w:sdt>
-                            <w:sdtPr>
-                              <w:rPr>
-                                <w:color w:val="404040" w:themeColor="text1" w:themeTint="BF"/>
-                                <w:sz w:val="24"/>
-                                <w:szCs w:val="24"/>
-                              </w:rPr>
-                              <w:alias w:val="Déclaration_dénomination"/>
-                              <w:tag w:val="Déclaration_dénomination"/>
-                              <w:id w:val="1225873524"/>
-                              <w:showingPlcHdr/>
-                            </w:sdtPr>
-                            <w:sdtContent>
-                              <w:p>
-                                <w:pPr>
-                                  <w:rPr>
-                                    <w:color w:val="404040" w:themeColor="text1" w:themeTint="BF"/>
-                                    <w:sz w:val="24"/>
-                                    <w:szCs w:val="24"/>
-                                  </w:rPr>
-                                </w:pPr>
-                                <w:r>
-                                  <w:rPr>
-                                    <w:rStyle w:val="Textedelespacerserv"/>
-                                    <w:color w:val="404040" w:themeColor="text1" w:themeTint="BF"/>
-                                    <w:sz w:val="24"/>
-                                    <w:szCs w:val="24"/>
-                                    <w:shd w:val="clear" w:color="auto" w:fill="BFBFBF" w:themeFill="background1" w:themeFillShade="BF"/>
-                                  </w:rPr>
-                                  <w:t/>
-                                </w:r>
-                              </w:p>
-                            </w:sdtContent>
-                          </w:sdt>
-                        </w:txbxContent>
-                      </wps:txbx>
-                      <wps:bodyPr rot="0" vert="horz" wrap="square" lIns="91440" tIns="45720" rIns="91440" bIns="45720" anchor="t" anchorCtr="0">
-                        <a:noAutofit/>
-                      </wps:bodyPr>
-                    </wps:wsp>
-                  </a:graphicData>
-                </a:graphic>
-                <wp14:sizeRelH relativeFrom="margin">
-                  <wp14:pctWidth>0</wp14:pctWidth>
-                </wp14:sizeRelH>
-                <wp14:sizeRelV relativeFrom="margin">
-                  <wp14:pctHeight>0</wp14:pctHeight>
-                </wp14:sizeRelV>
-              </wp:anchor>
-            </w:drawing>
-          </mc:Choice>
-          <mc:Fallback>
-            <w:pict>
-              <v:shapetype id="_x0000_t202" coordsize="21600,21600" o:spt="202" path="m,l,21600r21600,l21600,xe">
-                <v:stroke joinstyle="miter"/>
-                <v:path gradientshapeok="t" o:connecttype="rect"/>
-              </v:shapetype>
-              <v:shape id="Zone de texte 2" o:spid="_x0000_s1026" type="#_x0000_t202" style="position:absolute;margin-left:158.35pt;margin-top:9.7pt;width:284.95pt;height:30.6pt;z-index:251660288;visibility:visible;mso-wrap-style:square;mso-width-percent:0;mso-height-percent:0;mso-wrap-distance-left:9pt;mso-wrap-distance-top:0;mso-wrap-distance-right:9pt;mso-wrap-distance-bottom:0;mso-position-horizontal:absolute;mso-position-horizontal-relative:text;mso-position-vertical:absolute;mso-position-vertical-relative:text;mso-width-percent:0;mso-height-percent:0;mso-width-relative:margin;mso-height-relative:margin;v-text-anchor:top" o:gfxdata="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" filled="f" stroked="f">
-                <v:textbox>
-                  <w:txbxContent>
-                    <w:sdt>
-                      <w:sdtPr>
-                        <w:rPr>
-                          <w:color w:val="404040" w:themeColor="text1" w:themeTint="BF"/>
-                          <w:sz w:val="24"/>
-                          <w:szCs w:val="24"/>
-                        </w:rPr>
-                        <w:alias w:val="Déclaration_dénomination"/>
-                        <w:tag w:val="Déclaration_dénomination"/>
-                        <w:id w:val="1225873524"/>
-                        <w:showingPlcHdr/>
-                      </w:sdtPr>
-                      <w:sdtContent>
-                        <w:p>
-                          <w:pPr>
-                            <w:rPr>
-                              <w:color w:val="404040" w:themeColor="text1" w:themeTint="BF"/>
-                              <w:sz w:val="24"/>
-                              <w:szCs w:val="24"/>
-                            </w:rPr>
-                          </w:pPr>
-                          <w:r>
-                            <w:rPr>
-                              <w:rStyle w:val="Textedelespacerserv"/>
-                              <w:color w:val="404040" w:themeColor="text1" w:themeTint="BF"/>
-                              <w:sz w:val="24"/>
-                              <w:szCs w:val="24"/>
-                              <w:shd w:val="clear" w:color="auto" w:fill="BFBFBF" w:themeFill="background1" w:themeFillShade="BF"/>
-                            </w:rPr>
-                            <w:t/>
-                          </w:r>
-                        </w:p>
-                      </w:sdtContent>
-                    </w:sdt>
-                  </w:txbxContent>
-                </v:textbox>
-              </v:shape>
-            </w:pict>
-          </mc:Fallback>
-        </mc:AlternateContent>
-      </w:r>
-    </w:p>
-    <w:p>
-      <w:pPr>
         <w:tabs>
           <w:tab w:val="right" w:leader="dot" w:pos="8931"/>
         </w:tabs>
@@ -12971,325 +12715,6 @@
           <w:szCs w:val="24"/>
         </w:rPr>
       </w:pPr>
-    </w:p>
-    <w:p>
-      <w:pPr>
-        <w:spacing w:line="360" w:lineRule="auto"/>
-        <w:rPr>
-          <w:rFonts w:cstheme="minorHAnsi"/>
-          <w:color w:val="404040" w:themeColor="text1" w:themeTint="BF"/>
-          <w:sz w:val="24"/>
-          <w:szCs w:val="24"/>
-        </w:rPr>
-      </w:pPr>
-      <w:r>
-        <w:rPr>
-          <w:rFonts w:cstheme="minorHAnsi"/>
-          <w:noProof/>
-          <w:color w:val="404040" w:themeColor="text1" w:themeTint="BF"/>
-          <w:sz w:val="24"/>
-          <w:szCs w:val="24"/>
-          <w:lang w:eastAsia="fr-FR"/>
-        </w:rPr>
-        <mc:AlternateContent>
-          <mc:Choice Requires="wps">
-            <w:drawing>
-              <wp:anchor distT="0" distB="0" distL="114300" distR="114300" simplePos="0" relativeHeight="251661312" behindDoc="0" locked="0" layoutInCell="1" allowOverlap="1" wp14:anchorId="42524BB2" wp14:editId="6A2EBB03">
-                <wp:simplePos x="0" y="0"/>
-                <wp:positionH relativeFrom="column">
-                  <wp:posOffset>365125</wp:posOffset>
-                </wp:positionH>
-                <wp:positionV relativeFrom="paragraph">
-                  <wp:posOffset>330200</wp:posOffset>
-                </wp:positionV>
-                <wp:extent cx="2961640" cy="415925"/>
-                <wp:effectExtent l="0" t="0" r="0" b="3175"/>
-                <wp:wrapNone/>
-                <wp:docPr id="292" name="Zone de texte 2"/>
-                <wp:cNvGraphicFramePr>
-                  <a:graphicFrameLocks xmlns:a="http://schemas.openxmlformats.org/drawingml/2006/main"/>
-                </wp:cNvGraphicFramePr>
-                <a:graphic xmlns:a="http://schemas.openxmlformats.org/drawingml/2006/main">
-                  <a:graphicData uri="http://schemas.microsoft.com/office/word/2010/wordprocessingShape">
-                    <wps:wsp>
-                      <wps:cNvSpPr txBox="1">
-                        <a:spLocks noChangeArrowheads="1"/>
-                      </wps:cNvSpPr>
-                      <wps:spPr bwMode="auto">
-                        <a:xfrm>
-                          <a:off x="0" y="0"/>
-                          <a:ext cx="2961640" cy="415925"/>
-                        </a:xfrm>
-                        <a:prstGeom prst="rect">
-                          <a:avLst/>
-                        </a:prstGeom>
-                        <a:noFill/>
-                        <a:ln w="9525">
-                          <a:noFill/>
-                          <a:miter lim="800000"/>
-                          <a:headEnd/>
-                          <a:tailEnd/>
-                        </a:ln>
-                      </wps:spPr>
-                      <wps:txbx>
-                        <w:txbxContent>
-                          <w:sdt>
-                            <w:sdtPr>
-                              <w:rPr>
-                                <w:color w:val="404040" w:themeColor="text1" w:themeTint="BF"/>
-                                <w:sz w:val="24"/>
-                                <w:szCs w:val="24"/>
-                              </w:rPr>
-                              <w:alias w:val="Déclaration_fait à :"/>
-                              <w:tag w:val="Déclaration_fait à :"/>
-                              <w:id w:val="1639756654"/>
-                              <w:showingPlcHdr/>
-                            </w:sdtPr>
-                            <w:sdtContent>
-                              <w:p>
-                                <w:pPr>
-                                  <w:rPr>
-                                    <w:color w:val="404040" w:themeColor="text1" w:themeTint="BF"/>
-                                    <w:sz w:val="24"/>
-                                    <w:szCs w:val="24"/>
-                                  </w:rPr>
-                                </w:pPr>
-                                <w:r>
-                                  <w:rPr>
-                                    <w:color w:val="404040" w:themeColor="text1" w:themeTint="BF"/>
-                                    <w:sz w:val="24"/>
-                                    <w:szCs w:val="24"/>
-                                    <w:shd w:val="clear" w:color="auto" w:fill="BFBFBF" w:themeFill="background1" w:themeFillShade="BF"/>
-                                  </w:rPr>
-                                  <w:t/>
-                                </w:r>
-                              </w:p>
-                            </w:sdtContent>
-                          </w:sdt>
-                        </w:txbxContent>
-                      </wps:txbx>
-                      <wps:bodyPr rot="0" vert="horz" wrap="square" lIns="91440" tIns="45720" rIns="91440" bIns="45720" anchor="t" anchorCtr="0">
-                        <a:noAutofit/>
-                      </wps:bodyPr>
-                    </wps:wsp>
-                  </a:graphicData>
-                </a:graphic>
-                <wp14:sizeRelH relativeFrom="margin">
-                  <wp14:pctWidth>0</wp14:pctWidth>
-                </wp14:sizeRelH>
-                <wp14:sizeRelV relativeFrom="margin">
-                  <wp14:pctHeight>0</wp14:pctHeight>
-                </wp14:sizeRelV>
-              </wp:anchor>
-            </w:drawing>
-          </mc:Choice>
-          <mc:Fallback>
-            <w:pict>
-              <v:shape id="_x0000_s1027" type="#_x0000_t202" style="position:absolute;margin-left:28.75pt;margin-top:26pt;width:233.2pt;height:32.75pt;z-index:251661312;visibility:visible;mso-wrap-style:square;mso-width-percent:0;mso-height-percent:0;mso-wrap-distance-left:9pt;mso-wrap-distance-top:0;mso-wrap-distance-right:9pt;mso-wrap-distance-bottom:0;mso-position-horizontal:absolute;mso-position-horizontal-relative:text;mso-position-vertical:absolute;mso-position-vertical-relative:text;mso-width-percent:0;mso-height-percent:0;mso-width-relative:margin;mso-height-relative:margin;v-text-anchor:top" o:gfxdata="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" filled="f" stroked="f">
-                <v:textbox>
-                  <w:txbxContent>
-                    <w:sdt>
-                      <w:sdtPr>
-                        <w:rPr>
-                          <w:color w:val="404040" w:themeColor="text1" w:themeTint="BF"/>
-                          <w:sz w:val="24"/>
-                          <w:szCs w:val="24"/>
-                        </w:rPr>
-                        <w:alias w:val="Déclaration_fait à :"/>
-                        <w:tag w:val="Déclaration_fait à :"/>
-                        <w:id w:val="1639756654"/>
-                        <w:showingPlcHdr/>
-                      </w:sdtPr>
-                      <w:sdtContent>
-                        <w:p>
-                          <w:pPr>
-                            <w:rPr>
-                              <w:color w:val="404040" w:themeColor="text1" w:themeTint="BF"/>
-                              <w:sz w:val="24"/>
-                              <w:szCs w:val="24"/>
-                            </w:rPr>
-                          </w:pPr>
-                          <w:r>
-                            <w:rPr>
-                              <w:color w:val="404040" w:themeColor="text1" w:themeTint="BF"/>
-                              <w:sz w:val="24"/>
-                              <w:szCs w:val="24"/>
-                              <w:shd w:val="clear" w:color="auto" w:fill="BFBFBF" w:themeFill="background1" w:themeFillShade="BF"/>
-                            </w:rPr>
-                            <w:t/>
-                          </w:r>
-                        </w:p>
-                      </w:sdtContent>
-                    </w:sdt>
-                  </w:txbxContent>
-                </v:textbox>
-              </v:shape>
-            </w:pict>
-          </mc:Fallback>
-        </mc:AlternateContent>
-      </w:r>
-      <w:r>
-        <w:rPr>
-          <w:rFonts w:cstheme="minorHAnsi"/>
-          <w:b/>
-          <w:smallCaps/>
-          <w:noProof/>
-          <w:color w:val="404040" w:themeColor="text1" w:themeTint="BF"/>
-          <w:sz w:val="40"/>
-          <w:szCs w:val="40"/>
-          <w:lang w:eastAsia="fr-FR"/>
-        </w:rPr>
-        <mc:AlternateContent>
-          <mc:Choice Requires="wps">
-            <w:drawing>
-              <wp:anchor distT="0" distB="0" distL="114300" distR="114300" simplePos="0" relativeHeight="251659264" behindDoc="0" locked="0" layoutInCell="1" allowOverlap="1" wp14:anchorId="1DC949A5" wp14:editId="4E1AF377">
-                <wp:simplePos x="0" y="0"/>
-                <wp:positionH relativeFrom="column">
-                  <wp:posOffset>3527425</wp:posOffset>
-                </wp:positionH>
-                <wp:positionV relativeFrom="paragraph">
-                  <wp:posOffset>307340</wp:posOffset>
-                </wp:positionV>
-                <wp:extent cx="2188845" cy="494665"/>
-                <wp:effectExtent l="0" t="0" r="0" b="635"/>
-                <wp:wrapNone/>
-                <wp:docPr id="9" name="Zone de texte 2"/>
-                <wp:cNvGraphicFramePr>
-                  <a:graphicFrameLocks xmlns:a="http://schemas.openxmlformats.org/drawingml/2006/main"/>
-                </wp:cNvGraphicFramePr>
-                <a:graphic xmlns:a="http://schemas.openxmlformats.org/drawingml/2006/main">
-                  <a:graphicData uri="http://schemas.microsoft.com/office/word/2010/wordprocessingShape">
-                    <wps:wsp>
-                      <wps:cNvSpPr txBox="1">
-                        <a:spLocks noChangeArrowheads="1"/>
-                      </wps:cNvSpPr>
-                      <wps:spPr bwMode="auto">
-                        <a:xfrm>
-                          <a:off x="0" y="0"/>
-                          <a:ext cx="2188845" cy="494665"/>
-                        </a:xfrm>
-                        <a:prstGeom prst="rect">
-                          <a:avLst/>
-                        </a:prstGeom>
-                        <a:noFill/>
-                        <a:ln w="9525">
-                          <a:noFill/>
-                          <a:miter lim="800000"/>
-                          <a:headEnd/>
-                          <a:tailEnd/>
-                        </a:ln>
-                      </wps:spPr>
-                      <wps:txbx>
-                        <w:txbxContent>
-                          <w:sdt>
-                            <w:sdtPr>
-                              <w:rPr>
-                                <w:color w:val="404040" w:themeColor="text1" w:themeTint="BF"/>
-                                <w:sz w:val="24"/>
-                                <w:szCs w:val="24"/>
-                              </w:rPr>
-                              <w:alias w:val="Déclaration_Le :"/>
-                              <w:tag w:val="Déclaration_Le :"/>
-                              <w:id w:val="-526484609"/>
-                              <w:showingPlcHdr/>
-                              <w:date>
-                                <w:dateFormat w:val="dd/MM/yyyy"/>
-                                <w:lid w:val="fr-FR"/>
-                                <w:storeMappedDataAs w:val="dateTime"/>
-                                <w:calendar w:val="gregorian"/>
-                              </w:date>
-                            </w:sdtPr>
-                            <w:sdtContent>
-                              <w:p>
-                                <w:pPr>
-                                  <w:rPr>
-                                    <w:color w:val="404040" w:themeColor="text1" w:themeTint="BF"/>
-                                    <w:sz w:val="24"/>
-                                    <w:szCs w:val="24"/>
-                                  </w:rPr>
-                                </w:pPr>
-                                <w:r>
-                                  <w:rPr>
-                                    <w:rStyle w:val="Textedelespacerserv"/>
-                                    <w:color w:val="404040" w:themeColor="text1" w:themeTint="BF"/>
-                                    <w:sz w:val="24"/>
-                                    <w:szCs w:val="24"/>
-                                    <w:shd w:val="clear" w:color="auto" w:fill="BFBFBF" w:themeFill="background1" w:themeFillShade="BF"/>
-                                  </w:rPr>
-                                  <w:t/>
-                                </w:r>
-                              </w:p>
-                            </w:sdtContent>
-                          </w:sdt>
-                        </w:txbxContent>
-                      </wps:txbx>
-                      <wps:bodyPr rot="0" vert="horz" wrap="square" lIns="91440" tIns="45720" rIns="91440" bIns="45720" anchor="t" anchorCtr="0">
-                        <a:noAutofit/>
-                      </wps:bodyPr>
-                    </wps:wsp>
-                  </a:graphicData>
-                </a:graphic>
-                <wp14:sizeRelH relativeFrom="margin">
-                  <wp14:pctWidth>0</wp14:pctWidth>
-                </wp14:sizeRelH>
-                <wp14:sizeRelV relativeFrom="margin">
-                  <wp14:pctHeight>0</wp14:pctHeight>
-                </wp14:sizeRelV>
-              </wp:anchor>
-            </w:drawing>
-          </mc:Choice>
-          <mc:Fallback>
-            <w:pict>
-              <v:shape id="_x0000_s1028" type="#_x0000_t202" style="position:absolute;margin-left:277.75pt;margin-top:24.2pt;width:172.35pt;height:38.95pt;z-index:251659264;visibility:visible;mso-wrap-style:square;mso-width-percent:0;mso-height-percent:0;mso-wrap-distance-left:9pt;mso-wrap-distance-top:0;mso-wrap-distance-right:9pt;mso-wrap-distance-bottom:0;mso-position-horizontal:absolute;mso-position-horizontal-relative:text;mso-position-vertical:absolute;mso-position-vertical-relative:text;mso-width-percent:0;mso-height-percent:0;mso-width-relative:margin;mso-height-relative:margin;v-text-anchor:top" o:gfxdata="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" filled="f" stroked="f">
-                <v:textbox>
-                  <w:txbxContent>
-                    <w:sdt>
-                      <w:sdtPr>
-                        <w:rPr>
-                          <w:color w:val="404040" w:themeColor="text1" w:themeTint="BF"/>
-                          <w:sz w:val="24"/>
-                          <w:szCs w:val="24"/>
-                        </w:rPr>
-                        <w:alias w:val="Déclaration_Le :"/>
-                        <w:tag w:val="Déclaration_Le :"/>
-                        <w:id w:val="-526484609"/>
-                        <w:showingPlcHdr/>
-                        <w:date>
-                          <w:dateFormat w:val="dd/MM/yyyy"/>
-                          <w:lid w:val="fr-FR"/>
-                          <w:storeMappedDataAs w:val="dateTime"/>
-                          <w:calendar w:val="gregorian"/>
-                        </w:date>
-                      </w:sdtPr>
-                      <w:sdtContent>
-                        <w:p>
-                          <w:pPr>
-                            <w:rPr>
-                              <w:color w:val="404040" w:themeColor="text1" w:themeTint="BF"/>
-                              <w:sz w:val="24"/>
-                              <w:szCs w:val="24"/>
-                            </w:rPr>
-                          </w:pPr>
-                          <w:r>
-                            <w:rPr>
-                              <w:rStyle w:val="Textedelespacerserv"/>
-                              <w:color w:val="404040" w:themeColor="text1" w:themeTint="BF"/>
-                              <w:sz w:val="24"/>
-                              <w:szCs w:val="24"/>
-                              <w:shd w:val="clear" w:color="auto" w:fill="BFBFBF" w:themeFill="background1" w:themeFillShade="BF"/>
-                            </w:rPr>
-                            <w:t/>
-                          </w:r>
-                        </w:p>
-                      </w:sdtContent>
-                    </w:sdt>
-                  </w:txbxContent>
-                </v:textbox>
-              </v:shape>
-            </w:pict>
-          </mc:Fallback>
-        </mc:AlternateContent>
-      </w:r>
     </w:p>
     <w:p>
       <w:pPr>
@@ -14307,7 +13732,7 @@
       <w:r>
         <w:drawing>
           <wp:inline xmlns:a="http://schemas.openxmlformats.org/drawingml/2006/main" xmlns:pic="http://schemas.openxmlformats.org/drawingml/2006/picture">
-            <wp:extent cx="1371600" cy="9165102"/>
+            <wp:extent cx="862118" cy="5760720"/>
             <wp:docPr id="313" name="Picture 313"/>
             <wp:cNvGraphicFramePr>
               <a:graphicFrameLocks noChangeAspect="1"/>
@@ -14328,7 +13753,7 @@
                   <pic:spPr>
                     <a:xfrm>
                       <a:off x="0" y="0"/>
-                      <a:ext cx="1371600" cy="9165102"/>
+                      <a:ext cx="862118" cy="5760720"/>
                     </a:xfrm>
                     <a:prstGeom prst="rect"/>
                   </pic:spPr>

</xml_diff>

<commit_message>
Rename families → teams across dossiers (docs, vendored code, 3 PDFs)
Suite du nettoyage : « family » retiré de tous les livrables.

- cahier-des-charges.md + annexes (SCHEMA_BDD Mermaid, PLAN_DE_TESTS) :
  tables/colonnes families→teams, family_members→team_members,
  family_id→team_id, /families→/teams, FAM-→CREW-
- DP.md + fill_dp_template.py + DP_rempli.docx : FamilyContext→TeamContext,
  requireFamilyMember→requireTeamMember, MCD users/teams/team_members/shifts
- code/crew resynchronisé avec le dépôt crew (commit f27dea4)
- 3 PDF reconstruits (dossier-projet 11p, DP 18p, DP_rempli 28p via LibreOffice)
</commit_message>
<xml_diff>
--- a/dossier-professionnel/DP_rempli.docx
+++ b/dossier-professionnel/DP_rempli.docx
@@ -3597,7 +3597,7 @@
               <w:br/>
             </w:r>
             <w:r>
-              <w:t xml:space="preserve">• développé un système d'état global avec 5 contextes React superposés (AuthContext, FamilyContext, ThemeContext, ToastContext, ConfirmContext) exposés via des hooks personnalisés (useAuth, useFamily, useTheme…) ;</w:t>
+              <w:t xml:space="preserve">• développé un système d'état global avec 5 contextes React superposés (AuthContext, TeamContext, ThemeContext, ToastContext, ConfirmContext) exposés via des hooks personnalisés (useAuth, useTeam, useTheme…) ;</w:t>
             </w:r>
             <w:r>
               <w:br/>
@@ -6545,7 +6545,7 @@
               <w:br/>
             </w:r>
             <w:r>
-              <w:t xml:space="preserve">    family_id: familyId, from, to,</w:t>
+              <w:t xml:space="preserve">    team_id: teamId, from, to,</w:t>
             </w:r>
             <w:r>
               <w:br/>
@@ -6563,7 +6563,7 @@
               <w:br/>
             </w:r>
             <w:r>
-              <w:t xml:space="preserve">}, [familyId, from, to, perCell]);</w:t>
+              <w:t xml:space="preserve">}, [teamId, from, to, perCell]);</w:t>
             </w:r>
           </w:p>
         </w:tc>
@@ -7694,13 +7694,13 @@
               <w:br/>
             </w:r>
             <w:r>
-              <w:t xml:space="preserve">• MCD avec 4 entités (users, families, family_members, shifts) ;</w:t>
+              <w:t xml:space="preserve">• MCD avec 4 entités (users, teams, team_members, shifts) ;</w:t>
             </w:r>
             <w:r>
               <w:br/>
             </w:r>
             <w:r>
-              <w:t xml:space="preserve">• MLD avec clé primaire composite sur family_members (relation many-to-many) ;</w:t>
+              <w:t xml:space="preserve">• MLD avec clé primaire composite sur team_members (relation many-to-many) ;</w:t>
             </w:r>
             <w:r>
               <w:br/>
@@ -7748,7 +7748,7 @@
               <w:br/>
             </w:r>
             <w:r>
-              <w:t xml:space="preserve">• système de middlewares composables : authRequired → requireFamilyMember → requireAdmin ;</w:t>
+              <w:t xml:space="preserve">• système de middlewares composables : authRequired → requireTeamMember → requireAdmin ;</w:t>
             </w:r>
             <w:r>
               <w:br/>
@@ -9252,7 +9252,7 @@
               <w:br/>
             </w:r>
             <w:r>
-              <w:t xml:space="preserve">  • C2.4 — Middleware composable (authRequired → requireFamilyMember → requireAdmin) dans Express</w:t>
+              <w:t xml:space="preserve">  • C2.4 — Middleware composable (authRequired → requireTeamMember → requireAdmin) dans Express</w:t>
             </w:r>
             <w:r>
               <w:br/>
@@ -9324,7 +9324,7 @@
               <w:br/>
             </w:r>
             <w:r>
-              <w:t xml:space="preserve">• middlewares composables d'autorisation : requireFamilyMember (vérifie l'appartenance à l'équipe), requireAdmin (vérifie le rôle manager), assertCanManageShifts (combine les deux) ;</w:t>
+              <w:t xml:space="preserve">• middlewares composables d'autorisation : requireTeamMember (vérifie l'appartenance à l'équipe), requireAdmin (vérifie le rôle manager), assertCanManageShifts (combine les deux) ;</w:t>
             </w:r>
             <w:r>
               <w:br/>
@@ -10591,7 +10591,7 @@
               <w:br/>
             </w:r>
             <w:r>
-              <w:t xml:space="preserve">• endpoint distinct par équipe (calendar/:token/family/:familyId.ics) pour filtrer les shifts d'une seule équipe lorsque l'équipier appartient à plusieurs ;</w:t>
+              <w:t xml:space="preserve">• endpoint distinct par équipe (calendar/:token/team/:teamId.ics) pour filtrer les shifts d'une seule équipe lorsque l'équipier appartient à plusieurs ;</w:t>
             </w:r>
             <w:r>
               <w:br/>

</xml_diff>

<commit_message>
fix(DP): AT1 Exemple n°2 — 3 corrections factuelles
- Code extrait : handleDrop() → moveShift() (vrai nom + vraie signature)
  + garde anti-doublon + appel load() après succès
- Supprime l'affirmation fausse sur la matrice de polyvalence (canDropHere
  vérifie seulement la capacité cellule et la position source)
- Ajoute l'alternative clavier (WCAG 2.1.1) qui existe dans le code
  mais n'était pas mentionnée
- Ajoute useMemo dans les compétences C1.4
- PDF livrable reconstruit
</commit_message>
<xml_diff>
--- a/dossier-professionnel/DP_rempli.docx
+++ b/dossier-professionnel/DP_rempli.docx
@@ -5104,7 +5104,7 @@
           </w:tcPr>
           <w:p>
             <w:r>
-              <w:t xml:space="preserve">Compétences couvertes :</w:t>
+              <w:t>Compétences couvertes :</w:t>
             </w:r>
             <w:r>
               <w:br/>
@@ -5116,211 +5116,175 @@
               <w:br/>
             </w:r>
             <w:r>
-              <w:t xml:space="preserve">  • C1.3 — Interface dynamique (drag-and-drop HTML5 natif, rendu optimiste)</w:t>
+              <w:t xml:space="preserve">  • C1.3 — Interface dynamique (drag-and-drop HTML5 natif + alternative clavier, rendu optimiste)</w:t>
             </w:r>
             <w:r>
               <w:br/>
             </w:r>
             <w:r>
-              <w:t xml:space="preserve">  • C1.4 — Framework React (composants + hooks)</w:t>
+              <w:t xml:space="preserve">  • C1.4 — Framework React (composants + hooks, useMemo)</w:t>
             </w:r>
             <w:r>
               <w:br/>
             </w:r>
             <w:r>
-              <w:t xml:space="preserve"/>
+              <w:t/>
             </w:r>
             <w:r>
               <w:br/>
             </w:r>
             <w:r>
-              <w:t xml:space="preserve">Toujours sur le projet Crew, j'ai conçu la page Planning qui est le cœur d'utilisation quotidien du manager. Il s'agit d'une grille (équipiers × jours de la semaine) où chaque cellule représente les shifts d'un équipier sur une journée donnée.</w:t>
+              <w:t>Toujours sur le projet Crew, j’ai conçu la page Planning qui est le cœur d’utilisation quotidien du manager. Il s’agit d’une grille (équipiers × jours de la semaine) où chaque cellule représente les shifts d’un équipier sur une journée donnée.</w:t>
             </w:r>
             <w:r>
               <w:br/>
             </w:r>
             <w:r>
-              <w:t xml:space="preserve"/>
+              <w:t>Réalisations :</w:t>
             </w:r>
             <w:r>
               <w:br/>
             </w:r>
             <w:r>
-              <w:t xml:space="preserve">Réalisations :</w:t>
+              <w:t>• rendu d’une grille HTML &lt;table&gt; performante, scrollable horizontalement sur mobile, avec en-tête sticky et pastilles de santé du service (🟢 Saine / 🟠 Tendue / 🔴 Risque) en bas de chaque colonne jour ;</w:t>
             </w:r>
             <w:r>
               <w:br/>
             </w:r>
             <w:r>
-              <w:t xml:space="preserve"/>
+              <w:t>• regroupement visuel des équipiers par poste (cuisine d’abord, salle ensuite) avec un en-tête de groupe et une ligne « Extras » affichant les déficits de couverture par service ;</w:t>
             </w:r>
             <w:r>
               <w:br/>
             </w:r>
             <w:r>
-              <w:t xml:space="preserve">• rendu d'une grille HTML &lt;table&gt; performante, scrollable horizontalement sur mobile, avec en-tête sticky et pastilles de santé du service (🟢 Saine / 🟠 Tendue / 🔴 Risque) en bas de chaque colonne jour ;</w:t>
+              <w:t>• implémentation du DRAG-AND-DROP NATIF HTML5 sur les cartes de shifts : le manager déplace un shift d’un jour ou d’un équipier à l’autre, la grille met à jour l’état localement (rendu optimiste) puis appelle l’API (moveShift) ; si le back rejette (violation du plafond HCR 48 h/semaine), l’état est rollback automatiquement et un toast explique le motif ;</w:t>
             </w:r>
             <w:r>
               <w:br/>
             </w:r>
             <w:r>
-              <w:t xml:space="preserve"/>
+              <w:t>• limite à 2 shifts par cellule enforced côté client (canDropHere) — le drop est bloqué silencieusement si la cellule est pleine ou si c’est la même position source ;</w:t>
             </w:r>
             <w:r>
               <w:br/>
             </w:r>
             <w:r>
-              <w:t xml:space="preserve">• regroupement visuel des équipiers par poste (cuisine d'abord, salle ensuite) avec un en-tête de groupe et une ligne « Extras » en fin de groupe affichant les déficits de couverture par service ;</w:t>
+              <w:t>• alternative clavier complète (WCAG 2.1.1) : bouton « Déplacer » sur chaque shift, cibles « Déposer ici » navigables au clavier, annulation par Échap ;</w:t>
             </w:r>
             <w:r>
               <w:br/>
             </w:r>
             <w:r>
-              <w:t xml:space="preserve"/>
+              <w:t>• gestion des cartes en pleine largeur sur mobile via flexbox, tap-targets ≥ 44 px minimum ;</w:t>
             </w:r>
             <w:r>
               <w:br/>
             </w:r>
             <w:r>
-              <w:t xml:space="preserve">• implémentation du DRAG-AND-DROP NATIF HTML5 sur les cartes de shifts : le manager déplace un shift d'un jour ou d'un équipier à l'autre, la grille met à jour l'état localement (rendu optimiste) puis appelle l'API ; si le back rejette (par exemple violation du plafond HCR 48 h/semaine), l'état est rollback automatiquement et un toast d'erreur explique le motif ;</w:t>
+              <w:t>• dérivations d’état mémoïsées via useMemo (coverageIndex, healthIndex, overallIndex, extrasNeeded).</w:t>
             </w:r>
             <w:r>
               <w:br/>
             </w:r>
             <w:r>
-              <w:t xml:space="preserve"/>
+              <w:t/>
             </w:r>
             <w:r>
               <w:br/>
             </w:r>
             <w:r>
-              <w:t xml:space="preserve">• prise en compte de la polyvalence multi-skill pour la validation côté client — un slot refuse les drops dans une zone visuellement marquée « incompatible » avec animation CSS ;</w:t>
+              <w:t>Extrait du gestionnaire de déplacement (Planning.jsx, l. 285) :</w:t>
             </w:r>
             <w:r>
               <w:br/>
             </w:r>
             <w:r>
-              <w:t xml:space="preserve"/>
+              <w:t>// front/src/pages/Planning.jsx</w:t>
             </w:r>
             <w:r>
               <w:br/>
             </w:r>
             <w:r>
-              <w:t xml:space="preserve">• gestion des cartes en pleine largeur sur mobile via flexbox, conservant lisibilité et tap-targets de 44 px minimum.</w:t>
+              <w:t>async function moveShift(shift, newDate, newUserId) {</w:t>
             </w:r>
             <w:r>
               <w:br/>
             </w:r>
             <w:r>
-              <w:t xml:space="preserve"/>
+              <w:t xml:space="preserve">  if (shift.date.slice(0, 10) === newDate &amp;&amp; shift.user_id === newUserId) return;</w:t>
             </w:r>
             <w:r>
               <w:br/>
             </w:r>
             <w:r>
-              <w:t xml:space="preserve">Extrait du gestionnaire de drop :</w:t>
+              <w:t xml:space="preserve">  const prev = shifts;</w:t>
             </w:r>
             <w:r>
               <w:br/>
             </w:r>
             <w:r>
-              <w:t xml:space="preserve">// front/src/pages/Planning.jsx</w:t>
+              <w:t xml:space="preserve">  // Rendu optimiste : mise à jour locale immédiate</w:t>
             </w:r>
             <w:r>
               <w:br/>
             </w:r>
             <w:r>
-              <w:t xml:space="preserve">async function handleDrop(e, targetDate, targetUserId) {</w:t>
+              <w:t xml:space="preserve">  setShifts(shifts.map((s) =&gt; (s.id === shift.id</w:t>
             </w:r>
             <w:r>
               <w:br/>
             </w:r>
             <w:r>
-              <w:t xml:space="preserve">  e.preventDefault();</w:t>
+              <w:t xml:space="preserve">    ? { ...s, date: newDate, user_id: newUserId } : s)));</w:t>
             </w:r>
             <w:r>
               <w:br/>
             </w:r>
             <w:r>
-              <w:t xml:space="preserve">  const shiftId = e.dataTransfer.getData('shift-id');</w:t>
+              <w:t xml:space="preserve">  try {</w:t>
             </w:r>
             <w:r>
               <w:br/>
             </w:r>
             <w:r>
-              <w:t xml:space="preserve">  const prev = shifts;</w:t>
+              <w:t xml:space="preserve">    await shiftsApi.update(shift.id, { date: newDate, user_id: newUserId });</w:t>
             </w:r>
             <w:r>
               <w:br/>
             </w:r>
             <w:r>
-              <w:t xml:space="preserve">  // Optimistic update</w:t>
+              <w:t xml:space="preserve">    load(); // re-sync depuis l’API</w:t>
             </w:r>
             <w:r>
               <w:br/>
             </w:r>
             <w:r>
-              <w:t xml:space="preserve">  setShifts(shifts.map(s =&gt;</w:t>
+              <w:t xml:space="preserve">  } catch (err) {</w:t>
             </w:r>
             <w:r>
               <w:br/>
             </w:r>
             <w:r>
-              <w:t xml:space="preserve">    s.id === Number(shiftId)</w:t>
+              <w:t xml:space="preserve">    setShifts(prev);      // rollback automatique</w:t>
             </w:r>
             <w:r>
               <w:br/>
             </w:r>
             <w:r>
-              <w:t xml:space="preserve">      ? { ...s, date: targetDate, user_id: targetUserId }</w:t>
+              <w:t xml:space="preserve">    toast.fromError(err); // ex. « Plafond HCR 48 h/semaine dépassé »</w:t>
             </w:r>
             <w:r>
               <w:br/>
             </w:r>
             <w:r>
-              <w:t xml:space="preserve">      : s));</w:t>
+              <w:t xml:space="preserve">  }</w:t>
             </w:r>
             <w:r>
               <w:br/>
             </w:r>
             <w:r>
-              <w:t xml:space="preserve">  try {</w:t>
-            </w:r>
-            <w:r>
-              <w:br/>
-            </w:r>
-            <w:r>
-              <w:t xml:space="preserve">    await shiftsApi.update(shiftId, { date: targetDate, user_id: targetUserId });</w:t>
-            </w:r>
-            <w:r>
-              <w:br/>
-            </w:r>
-            <w:r>
-              <w:t xml:space="preserve">  } catch (err) {</w:t>
-            </w:r>
-            <w:r>
-              <w:br/>
-            </w:r>
-            <w:r>
-              <w:t xml:space="preserve">    setShifts(prev);  // rollback</w:t>
-            </w:r>
-            <w:r>
-              <w:br/>
-            </w:r>
-            <w:r>
-              <w:t xml:space="preserve">    toast.fromError(err);</w:t>
-            </w:r>
-            <w:r>
-              <w:br/>
-            </w:r>
-            <w:r>
-              <w:t xml:space="preserve">  }</w:t>
-            </w:r>
-            <w:r>
-              <w:br/>
-            </w:r>
-            <w:r>
-              <w:t xml:space="preserve">}</w:t>
+              <w:t>}</w:t>
             </w:r>
           </w:p>
         </w:tc>

</xml_diff>

<commit_message>
fix(dp): supprime orphelin "2. Précisez les moyens" en bas de page
Scinde la table AT1 Exemple n°2 en deux au niveau de la question 2,
avec un saut de page entre les deux moitiés (LibreOffice ignore w:br
type=page dans les cellules de tableau).
</commit_message>
<xml_diff>
--- a/dossier-professionnel/DP_rempli.docx
+++ b/dossier-professionnel/DP_rempli.docx
@@ -5383,6 +5383,43 @@
           </w:p>
         </w:tc>
       </w:tr>
+    </w:tbl>
+    <w:p>
+      <w:pPr>
+        <w:pageBreakBefore/>
+        <w:spacing w:before="0" w:after="0" w:line="20" w:lineRule="exact"/>
+        <w:rPr>
+          <w:sz w:val="2"/>
+        </w:rPr>
+      </w:pPr>
+    </w:p>
+    <w:tbl>
+      <w:tblPr>
+        <w:tblStyle w:val="Grilledutableau"/>
+        <w:tblW w:w="10349" w:type="dxa"/>
+        <w:tblInd w:w="-318" w:type="dxa"/>
+        <w:tblBorders>
+          <w:top w:val="none" w:sz="0" w:space="0" w:color="auto"/>
+          <w:left w:val="none" w:sz="0" w:space="0" w:color="auto"/>
+          <w:bottom w:val="none" w:sz="0" w:space="0" w:color="auto"/>
+          <w:right w:val="none" w:sz="0" w:space="0" w:color="auto"/>
+          <w:insideH w:val="none" w:sz="0" w:space="0" w:color="auto"/>
+          <w:insideV w:val="none" w:sz="0" w:space="0" w:color="auto"/>
+        </w:tblBorders>
+        <w:tblLayout w:type="fixed"/>
+        <w:tblCellMar>
+          <w:top w:w="57" w:type="dxa"/>
+        </w:tblCellMar>
+        <w:tblLook w:val="04A0" w:firstRow="1" w:lastRow="0" w:firstColumn="1" w:lastColumn="0" w:noHBand="0" w:noVBand="1"/>
+      </w:tblPr>
+      <w:tblGrid>
+        <w:gridCol w:w="2411"/>
+        <w:gridCol w:w="567"/>
+        <w:gridCol w:w="576"/>
+        <w:gridCol w:w="1283"/>
+        <w:gridCol w:w="4945"/>
+        <w:gridCol w:w="567"/>
+      </w:tblGrid>
       <w:tr>
         <w:tc>
           <w:tcPr>

</xml_diff>

<commit_message>
fix(dp): saut de page avant en-tête Exemple n°2 (orphelin bas p.7)
</commit_message>
<xml_diff>
--- a/dossier-professionnel/DP_rempli.docx
+++ b/dossier-professionnel/DP_rempli.docx
@@ -4790,6 +4790,12 @@
         </w:tc>
       </w:tr>
     </w:tbl>
+    <w:p>
+      <w:pPr>
+        <w:pageBreakBefore/>
+        <w:spacing w:before="0" w:after="0" w:line="20" w:lineRule="exact"/>
+      </w:pPr>
+    </w:p>
     <w:tbl>
       <w:tblPr>
         <w:tblStyle w:val="Grilledutableau"/>

</xml_diff>

<commit_message>
fix(dp): page 9 vide + orphelin Titres diplômes bas de page
</commit_message>
<xml_diff>
--- a/dossier-professionnel/DP_rempli.docx
+++ b/dossier-professionnel/DP_rempli.docx
@@ -5295,100 +5295,6 @@
           </w:p>
         </w:tc>
       </w:tr>
-      <w:tr>
-        <w:trPr>
-          <w:trHeight w:val="142"/>
-        </w:trPr>
-        <w:tc>
-          <w:tcPr>
-            <w:tcW w:w="10349" w:type="dxa"/>
-            <w:gridSpan w:val="6"/>
-            <w:tcBorders>
-              <w:left w:val="single" w:sz="8" w:space="0" w:color="BFBFBF" w:themeColor="background1" w:themeShade="BF"/>
-              <w:right w:val="single" w:sz="8" w:space="0" w:color="BFBFBF" w:themeColor="background1" w:themeShade="BF"/>
-            </w:tcBorders>
-          </w:tcPr>
-          <w:p>
-            <w:pPr>
-              <w:widowControl w:val="0"/>
-              <w:rPr>
-                <w:rFonts w:cstheme="minorHAnsi"/>
-                <w:color w:val="404040" w:themeColor="text1" w:themeTint="BF"/>
-                <w:sz w:val="24"/>
-              </w:rPr>
-            </w:pPr>
-          </w:p>
-        </w:tc>
-      </w:tr>
-      <w:tr>
-        <w:trPr>
-          <w:trHeight w:val="142"/>
-        </w:trPr>
-        <w:tc>
-          <w:tcPr>
-            <w:tcW w:w="10349" w:type="dxa"/>
-            <w:gridSpan w:val="6"/>
-            <w:tcBorders>
-              <w:left w:val="single" w:sz="8" w:space="0" w:color="BFBFBF" w:themeColor="background1" w:themeShade="BF"/>
-              <w:bottom w:val="single" w:sz="8" w:space="0" w:color="BFBFBF" w:themeColor="background1" w:themeShade="BF"/>
-              <w:right w:val="single" w:sz="8" w:space="0" w:color="BFBFBF" w:themeColor="background1" w:themeShade="BF"/>
-            </w:tcBorders>
-          </w:tcPr>
-          <w:p>
-            <w:pPr>
-              <w:rPr>
-                <w:rFonts w:cstheme="minorHAnsi"/>
-                <w:color w:val="404040" w:themeColor="text1" w:themeTint="BF"/>
-                <w:sz w:val="12"/>
-                <w:szCs w:val="16"/>
-              </w:rPr>
-            </w:pPr>
-          </w:p>
-        </w:tc>
-      </w:tr>
-      <w:tr>
-        <w:trPr>
-          <w:gridAfter w:val="1"/>
-          <w:wAfter w:w="567" w:type="dxa"/>
-        </w:trPr>
-        <w:tc>
-          <w:tcPr>
-            <w:tcW w:w="9782" w:type="dxa"/>
-            <w:gridSpan w:val="5"/>
-          </w:tcPr>
-          <w:p>
-            <w:pPr>
-              <w:rPr>
-                <w:rFonts w:cstheme="minorHAnsi"/>
-                <w:b/>
-                <w:color w:val="404040" w:themeColor="text1" w:themeTint="BF"/>
-                <w:sz w:val="12"/>
-                <w:szCs w:val="16"/>
-              </w:rPr>
-            </w:pPr>
-          </w:p>
-        </w:tc>
-      </w:tr>
-      <w:tr>
-        <w:tc>
-          <w:tcPr>
-            <w:tcW w:w="10349" w:type="dxa"/>
-            <w:gridSpan w:val="6"/>
-          </w:tcPr>
-          <w:p>
-            <w:pPr>
-              <w:keepNext/>
-              <w:rPr>
-                <w:rFonts w:cstheme="minorHAnsi"/>
-                <w:b/>
-                <w:color w:val="404040" w:themeColor="text1" w:themeTint="BF"/>
-                <w:sz w:val="12"/>
-                <w:szCs w:val="16"/>
-              </w:rPr>
-            </w:pPr>
-          </w:p>
-        </w:tc>
-      </w:tr>
     </w:tbl>
     <w:p>
       <w:pPr>
@@ -11475,6 +11381,12 @@
       </w:tr>
     </w:tbl>
     <w:p/>
+    <w:p>
+      <w:pPr>
+        <w:pageBreakBefore/>
+        <w:spacing w:before="0" w:after="0" w:line="20" w:lineRule="exact"/>
+      </w:pPr>
+    </w:p>
     <w:tbl>
       <w:tblPr>
         <w:tblStyle w:val="Grilledutableau"/>

</xml_diff>

<commit_message>
fix(dp): orphelin AT1 Ex3 (p.10) + ligne vide AT2 Ex1 (p.14)
- Table 7 (AT1 Ex3) : supprime lignes fantômes 6-9, divise à la section 2
  → "2. Précisez les moyens" démarre en haut de page 11 au lieu du bas p.10
- Table 8 (AT2 Ex1) : supprime lignes fantômes 12-15 entre section 2 et 3
  → supprime la fine ligne vide en tête de page 14
</commit_message>
<xml_diff>
--- a/dossier-professionnel/DP_rempli.docx
+++ b/dossier-professionnel/DP_rempli.docx
@@ -6481,100 +6481,40 @@
           </w:p>
         </w:tc>
       </w:tr>
-      <w:tr>
-        <w:trPr>
-          <w:trHeight w:val="142"/>
-        </w:trPr>
-        <w:tc>
-          <w:tcPr>
-            <w:tcW w:w="10349" w:type="dxa"/>
-            <w:gridSpan w:val="6"/>
-            <w:tcBorders>
-              <w:left w:val="single" w:sz="8" w:space="0" w:color="BFBFBF" w:themeColor="background1" w:themeShade="BF"/>
-              <w:right w:val="single" w:sz="8" w:space="0" w:color="BFBFBF" w:themeColor="background1" w:themeShade="BF"/>
-            </w:tcBorders>
-          </w:tcPr>
-          <w:p>
-            <w:pPr>
-              <w:widowControl w:val="0"/>
-              <w:rPr>
-                <w:rFonts w:cstheme="minorHAnsi"/>
-                <w:color w:val="404040" w:themeColor="text1" w:themeTint="BF"/>
-                <w:sz w:val="24"/>
-              </w:rPr>
-            </w:pPr>
-          </w:p>
-        </w:tc>
-      </w:tr>
-      <w:tr>
-        <w:trPr>
-          <w:trHeight w:val="142"/>
-        </w:trPr>
-        <w:tc>
-          <w:tcPr>
-            <w:tcW w:w="10349" w:type="dxa"/>
-            <w:gridSpan w:val="6"/>
-            <w:tcBorders>
-              <w:left w:val="single" w:sz="8" w:space="0" w:color="BFBFBF" w:themeColor="background1" w:themeShade="BF"/>
-              <w:bottom w:val="single" w:sz="8" w:space="0" w:color="BFBFBF" w:themeColor="background1" w:themeShade="BF"/>
-              <w:right w:val="single" w:sz="8" w:space="0" w:color="BFBFBF" w:themeColor="background1" w:themeShade="BF"/>
-            </w:tcBorders>
-          </w:tcPr>
-          <w:p>
-            <w:pPr>
-              <w:rPr>
-                <w:rFonts w:cstheme="minorHAnsi"/>
-                <w:color w:val="404040" w:themeColor="text1" w:themeTint="BF"/>
-                <w:sz w:val="12"/>
-                <w:szCs w:val="16"/>
-              </w:rPr>
-            </w:pPr>
-          </w:p>
-        </w:tc>
-      </w:tr>
-      <w:tr>
-        <w:trPr>
-          <w:gridAfter w:val="1"/>
-          <w:wAfter w:w="567" w:type="dxa"/>
-        </w:trPr>
-        <w:tc>
-          <w:tcPr>
-            <w:tcW w:w="9782" w:type="dxa"/>
-            <w:gridSpan w:val="5"/>
-          </w:tcPr>
-          <w:p>
-            <w:pPr>
-              <w:rPr>
-                <w:rFonts w:cstheme="minorHAnsi"/>
-                <w:b/>
-                <w:color w:val="404040" w:themeColor="text1" w:themeTint="BF"/>
-                <w:sz w:val="12"/>
-                <w:szCs w:val="16"/>
-              </w:rPr>
-            </w:pPr>
-          </w:p>
-        </w:tc>
-      </w:tr>
-      <w:tr>
-        <w:tc>
-          <w:tcPr>
-            <w:tcW w:w="10349" w:type="dxa"/>
-            <w:gridSpan w:val="6"/>
-          </w:tcPr>
-          <w:p>
-            <w:pPr>
-              <w:keepNext/>
-              <w:rPr>
-                <w:rFonts w:cstheme="minorHAnsi"/>
-                <w:b/>
-                <w:color w:val="404040" w:themeColor="text1" w:themeTint="BF"/>
-                <w:sz w:val="12"/>
-                <w:szCs w:val="16"/>
-              </w:rPr>
-            </w:pPr>
-          </w:p>
-        </w:tc>
-      </w:tr>
+    </w:tbl>
+    <w:p>
+      <w:pPr>
+        <w:pageBreakBefore/>
+        <w:spacing w:before="0" w:after="0" w:line="20" w:lineRule="exact"/>
+      </w:pPr>
+    </w:p>
+    <w:tbl>
+      <w:tblPr>
+        <w:tblStyle w:val="Grilledutableau"/>
+        <w:tblW w:w="10349" w:type="dxa"/>
+        <w:tblInd w:w="-318" w:type="dxa"/>
+        <w:tblBorders>
+          <w:top w:val="none" w:sz="0" w:space="0" w:color="auto"/>
+          <w:left w:val="none" w:sz="0" w:space="0" w:color="auto"/>
+          <w:bottom w:val="none" w:sz="0" w:space="0" w:color="auto"/>
+          <w:right w:val="none" w:sz="0" w:space="0" w:color="auto"/>
+          <w:insideH w:val="none" w:sz="0" w:space="0" w:color="auto"/>
+          <w:insideV w:val="none" w:sz="0" w:space="0" w:color="auto"/>
+        </w:tblBorders>
+        <w:tblLayout w:type="fixed"/>
+        <w:tblCellMar>
+          <w:top w:w="57" w:type="dxa"/>
+        </w:tblCellMar>
+        <w:tblLook w:val="04A0" w:firstRow="1" w:lastRow="0" w:firstColumn="1" w:lastColumn="0" w:noHBand="0" w:noVBand="1"/>
+      </w:tblPr>
+      <w:tblGrid>
+        <w:gridCol w:w="2411"/>
+        <w:gridCol w:w="567"/>
+        <w:gridCol w:w="576"/>
+        <w:gridCol w:w="1283"/>
+        <w:gridCol w:w="4945"/>
+        <w:gridCol w:w="567"/>
+      </w:tblGrid>
       <w:tr>
         <w:tc>
           <w:tcPr>
@@ -8115,96 +8055,6 @@
             </w:r>
             <w:r>
               <w:t xml:space="preserve">  • Suite Playwright de 60+ scénarios couvrant authentification, équipes, shifts, smart planner, conformité HCR, polyvalence multi-skill, cost-aware. Bilan : 29/29 PASS sur les tests v2 (bloc 10 du Plan de tests, voir annexe).</w:t>
-            </w:r>
-          </w:p>
-        </w:tc>
-      </w:tr>
-      <w:tr>
-        <w:trPr>
-          <w:trHeight w:val="142"/>
-        </w:trPr>
-        <w:tc>
-          <w:tcPr>
-            <w:tcW w:w="10349" w:type="dxa"/>
-            <w:gridSpan w:val="6"/>
-            <w:tcBorders>
-              <w:left w:val="single" w:sz="8" w:space="0" w:color="BFBFBF" w:themeColor="background1" w:themeShade="BF"/>
-              <w:right w:val="single" w:sz="8" w:space="0" w:color="BFBFBF" w:themeColor="background1" w:themeShade="BF"/>
-            </w:tcBorders>
-          </w:tcPr>
-          <w:p>
-            <w:pPr>
-              <w:widowControl w:val="0"/>
-              <w:rPr>
-                <w:rFonts w:cstheme="minorHAnsi"/>
-                <w:color w:val="404040" w:themeColor="text1" w:themeTint="BF"/>
-                <w:sz w:val="24"/>
-              </w:rPr>
-            </w:pPr>
-          </w:p>
-        </w:tc>
-      </w:tr>
-      <w:tr>
-        <w:trPr>
-          <w:trHeight w:val="142"/>
-        </w:trPr>
-        <w:tc>
-          <w:tcPr>
-            <w:tcW w:w="10349" w:type="dxa"/>
-            <w:gridSpan w:val="6"/>
-            <w:tcBorders>
-              <w:left w:val="single" w:sz="8" w:space="0" w:color="BFBFBF" w:themeColor="background1" w:themeShade="BF"/>
-              <w:bottom w:val="single" w:sz="8" w:space="0" w:color="BFBFBF" w:themeColor="background1" w:themeShade="BF"/>
-              <w:right w:val="single" w:sz="8" w:space="0" w:color="BFBFBF" w:themeColor="background1" w:themeShade="BF"/>
-            </w:tcBorders>
-          </w:tcPr>
-          <w:p>
-            <w:pPr>
-              <w:rPr>
-                <w:rFonts w:cstheme="minorHAnsi"/>
-                <w:color w:val="404040" w:themeColor="text1" w:themeTint="BF"/>
-                <w:sz w:val="12"/>
-                <w:szCs w:val="16"/>
-              </w:rPr>
-            </w:pPr>
-          </w:p>
-        </w:tc>
-      </w:tr>
-      <w:tr>
-        <w:tc>
-          <w:tcPr>
-            <w:tcW w:w="10349" w:type="dxa"/>
-            <w:gridSpan w:val="6"/>
-          </w:tcPr>
-          <w:p>
-            <w:pPr>
-              <w:keepNext/>
-              <w:rPr>
-                <w:sz w:val="12"/>
-              </w:rPr>
-            </w:pPr>
-          </w:p>
-        </w:tc>
-      </w:tr>
-      <w:tr>
-        <w:tc>
-          <w:tcPr>
-            <w:tcW w:w="10349" w:type="dxa"/>
-            <w:gridSpan w:val="6"/>
-          </w:tcPr>
-          <w:p>
-            <w:pPr>
-              <w:keepNext/>
-              <w:rPr>
-                <w:rFonts w:cstheme="minorHAnsi"/>
-                <w:b/>
-                <w:color w:val="404040" w:themeColor="text1" w:themeTint="BF"/>
-                <w:sz w:val="12"/>
-                <w:szCs w:val="16"/>
-              </w:rPr>
-            </w:pPr>
-            <w:r>
-              <w:br w:type="page"/>
             </w:r>
           </w:p>
         </w:tc>

</xml_diff>